<commit_message>
feat(core): audit and refactor structural calculation engine per TCVN 11823:2017
- Bearings: 1D elastic stiffness compatibility matrix & friction decoupling
- Biaxial column: 3D fiber angle integration & Bresler load contour interaction
- Twin pier: Portal frame subframe distribution with static equilibrium invariance
- Prestressed cap: TCVN 11823-5 losses and construction stages decomposition
- TS_PILE & TS_CAP: 6DOF matrix diagnostics, rigid cap analytical solver, limit state capacity mapping
- Live load: HL-93 influence-line response for unequal spans and multi-lane envelopes
- Verification: 33 analytical & regression tests passing 100%
- Documentation: ENGINEERING_AUDIT.md and VALIDATION_MATRIX.md
</commit_message>
<xml_diff>
--- a/output_reports/Trụ T1 (1 Thân RC)_Bao_cao.docx
+++ b/output_reports/Trụ T1 (1 Thân RC)_Bao_cao.docx
@@ -3052,7 +3052,7 @@
                 <w:rFonts w:ascii="Times New Roman" w:hAnsi="Times New Roman"/>
                 <w:sz w:val="17"/>
               </w:rPr>
-              <w:t>Góc chéo α = 90°</w:t>
+              <w:t>Góc chéo α = 90.0°</w:t>
             </w:r>
           </w:p>
         </w:tc>
@@ -4699,7 +4699,7 @@
                 <w:rFonts w:ascii="Times New Roman" w:hAnsi="Times New Roman"/>
                 <w:sz w:val="17"/>
               </w:rPr>
-              <w:t>Gia tốc A=0.1108, S=1.2, R_stem=3, R_móng=1.0</w:t>
+              <w:t>Gia tốc A=0.1108, S=1.2, R_stem=3.0, R_móng=1.0</w:t>
             </w:r>
           </w:p>
         </w:tc>
@@ -13564,7 +13564,7 @@
       <w:r>
         <w:t>• Đường kính cọc D = 1.2 m | Chiều dài cọc L = 35.00 m</w:t>
         <w:br/>
-        <w:t>• Cao độ đáy bệ = 0 m | Cao độ mũi cọc = -35 m | Mực nước = 2 m</w:t>
+        <w:t>• Cao độ đáy bệ = 0.0 m | Cao độ mũi cọc = -35.0 m | Mực nước = 2.0 m</w:t>
         <w:br/>
         <w:t>• Sức kháng ma sát thân danh định: Qsn = 9883.6 kN</w:t>
         <w:br/>
@@ -24675,7 +24675,7 @@
     </w:p>
     <w:p>
       <w:r>
-        <w:t>• Xà mũ bê tông cốt thép thường (RC): Chiều rộng bxm = 2.5m, Chiều cao ngàm h_root = 2.2m, Chiều dài cánh hẫng = 7m</w:t>
+        <w:t>• Xà mũ bê tông cốt thép thường (RC): Chiều rộng bxm = 2.5m, Chiều cao ngàm h_root = 2.2m, Chiều dài cánh hẫng = 7.0m</w:t>
         <w:br/>
         <w:t>• Mô men uốn tính toán lớn nhất: Mu = 69172.1 kNm ➔ Sức kháng uốn Mr = 99054.9 kNm (ĐẠT)</w:t>
         <w:br/>
@@ -24719,7 +24719,7 @@
     </w:p>
     <w:p>
       <w:r>
-        <w:t>• Kích thước đài bệ: 6m (dọc) × 11.4m (ngang) × 2m (cao)</w:t>
+        <w:t>• Kích thước đài bệ: 6.0m (dọc) × 11.4m (ngang) × 2.0m (cao)</w:t>
         <w:br/>
         <w:t>• Sức kháng uốn phương X (dọc cầu): Mux = 38147.4 kNm &lt;= Mrx = 39164.1 kNm (ĐẠT)</w:t>
         <w:br/>

</xml_diff>